<commit_message>
Messtechnik bericht für Kontrolle
</commit_message>
<xml_diff>
--- a/Semester_3/Messtechnik/Labor/Versuch3_TM/Labor Messtechnik TM.docx
+++ b/Semester_3/Messtechnik/Labor/Versuch3_TM/Labor Messtechnik TM.docx
@@ -12233,19 +12233,11 @@
         <w:lastRenderedPageBreak/>
         <w:t xml:space="preserve">2.4 </w:t>
       </w:r>
-      <w:proofErr w:type="spellStart"/>
       <w:r>
         <w:rPr>
           <w:rFonts w:asciiTheme="minorHAnsi" w:hAnsiTheme="minorHAnsi"/>
         </w:rPr>
-        <w:t>Ratiometrische</w:t>
-      </w:r>
-      <w:proofErr w:type="spellEnd"/>
-      <w:r>
-        <w:rPr>
-          <w:rFonts w:asciiTheme="minorHAnsi" w:hAnsiTheme="minorHAnsi"/>
-        </w:rPr>
-        <w:t xml:space="preserve"> Temperaturmessung</w:t>
+        <w:t>Ratiometrische Temperaturmessung</w:t>
       </w:r>
       <w:r>
         <w:rPr>
@@ -21274,23 +21266,7 @@
           <w:rFonts w:asciiTheme="minorHAnsi" w:hAnsiTheme="minorHAnsi"/>
           <w:sz w:val="24"/>
         </w:rPr>
-        <w:t xml:space="preserve"> Typ K </w:t>
-      </w:r>
-      <w:proofErr w:type="spellStart"/>
-      <w:r>
-        <w:rPr>
-          <w:rFonts w:asciiTheme="minorHAnsi" w:hAnsiTheme="minorHAnsi"/>
-          <w:sz w:val="24"/>
-        </w:rPr>
-        <w:t>NiCr</w:t>
-      </w:r>
-      <w:proofErr w:type="spellEnd"/>
-      <w:r>
-        <w:rPr>
-          <w:rFonts w:asciiTheme="minorHAnsi" w:hAnsiTheme="minorHAnsi"/>
-          <w:sz w:val="24"/>
-        </w:rPr>
-        <w:t>- Ni- Thermoelement</w:t>
+        <w:t xml:space="preserve"> Typ K NiCr- Ni- Thermoelement</w:t>
       </w:r>
       <w:r>
         <w:rPr>
@@ -21429,23 +21405,7 @@
           <w:rFonts w:asciiTheme="minorHAnsi" w:hAnsiTheme="minorHAnsi"/>
           <w:sz w:val="24"/>
         </w:rPr>
-        <w:t xml:space="preserve"> zur besseren Kontrollierbarkeit versehen. Die Betriebsspannung wurde durch ein Labornetzgerät mit Strombegrenzung realisiert. An den Klemmen Sense+ und Sense- wird über den Spannungsabfall an einem </w:t>
-      </w:r>
-      <w:proofErr w:type="spellStart"/>
-      <w:r>
-        <w:rPr>
-          <w:rFonts w:asciiTheme="minorHAnsi" w:hAnsiTheme="minorHAnsi"/>
-          <w:sz w:val="24"/>
-        </w:rPr>
-        <w:t>Schuntwiderstand</w:t>
-      </w:r>
-      <w:proofErr w:type="spellEnd"/>
-      <w:r>
-        <w:rPr>
-          <w:rFonts w:asciiTheme="minorHAnsi" w:hAnsiTheme="minorHAnsi"/>
-          <w:sz w:val="24"/>
-        </w:rPr>
-        <w:t xml:space="preserve"> der Kollektorstrom gemessen.</w:t>
+        <w:t xml:space="preserve"> zur besseren Kontrollierbarkeit versehen. Die Betriebsspannung wurde durch ein Labornetzgerät mit Strombegrenzung realisiert. An den Klemmen Sense+ und Sense- wird über den Spannungsabfall an einem Schuntwiderstand der Kollektorstrom gemessen.</w:t>
       </w:r>
     </w:p>
     <w:p>
@@ -21516,23 +21476,7 @@
           <w:rFonts w:asciiTheme="minorHAnsi" w:hAnsiTheme="minorHAnsi"/>
           <w:sz w:val="24"/>
         </w:rPr>
-        <w:t xml:space="preserve"> neben Thermoelement- und </w:t>
-      </w:r>
-      <w:proofErr w:type="spellStart"/>
-      <w:r>
-        <w:rPr>
-          <w:rFonts w:asciiTheme="minorHAnsi" w:hAnsiTheme="minorHAnsi"/>
-          <w:sz w:val="24"/>
-        </w:rPr>
-        <w:t>Thermistortemperaturen</w:t>
-      </w:r>
-      <w:proofErr w:type="spellEnd"/>
-      <w:r>
-        <w:rPr>
-          <w:rFonts w:asciiTheme="minorHAnsi" w:hAnsiTheme="minorHAnsi"/>
-          <w:sz w:val="24"/>
-        </w:rPr>
-        <w:t xml:space="preserve"> auch die Basis-Emitter- Spannung </w:t>
+        <w:t xml:space="preserve"> neben Thermoelement- und Thermistortemperaturen auch die Basis-Emitter- Spannung </w:t>
       </w:r>
       <m:oMath>
         <m:sSub>
@@ -25895,13 +25839,8 @@
                               <w:t xml:space="preserve">) mit Scheibe </w:t>
                             </w:r>
                             <w:r>
-                              <w:t xml:space="preserve">nach </w:t>
+                              <w:t>nach paramID</w:t>
                             </w:r>
-                            <w:proofErr w:type="spellStart"/>
-                            <w:r>
-                              <w:t>paramID</w:t>
-                            </w:r>
-                            <w:proofErr w:type="spellEnd"/>
                           </w:p>
                         </w:txbxContent>
                       </wps:txbx>
@@ -25989,13 +25928,8 @@
                         <w:t xml:space="preserve">) mit Scheibe </w:t>
                       </w:r>
                       <w:r>
-                        <w:t xml:space="preserve">nach </w:t>
+                        <w:t>nach paramID</w:t>
                       </w:r>
-                      <w:proofErr w:type="spellStart"/>
-                      <w:r>
-                        <w:t>paramID</w:t>
-                      </w:r>
-                      <w:proofErr w:type="spellEnd"/>
                     </w:p>
                   </w:txbxContent>
                 </v:textbox>
@@ -26114,13 +26048,8 @@
                               <w:t>)</w:t>
                             </w:r>
                             <w:r>
-                              <w:t xml:space="preserve"> ohne Scheibe nach </w:t>
+                              <w:t xml:space="preserve"> ohne Scheibe nach paramID</w:t>
                             </w:r>
-                            <w:proofErr w:type="spellStart"/>
-                            <w:r>
-                              <w:t>paramID</w:t>
-                            </w:r>
-                            <w:proofErr w:type="spellEnd"/>
                           </w:p>
                         </w:txbxContent>
                       </wps:txbx>
@@ -26208,13 +26137,8 @@
                         <w:t>)</w:t>
                       </w:r>
                       <w:r>
-                        <w:t xml:space="preserve"> ohne Scheibe nach </w:t>
+                        <w:t xml:space="preserve"> ohne Scheibe nach paramID</w:t>
                       </w:r>
-                      <w:proofErr w:type="spellStart"/>
-                      <w:r>
-                        <w:t>paramID</w:t>
-                      </w:r>
-                      <w:proofErr w:type="spellEnd"/>
                     </w:p>
                   </w:txbxContent>
                 </v:textbox>
@@ -30263,15 +30187,37 @@
         </w:rPr>
         <w:t>Beim Vergleich der beiden Transistoren zeigt sich ein deutlicher Einfluss der keramischen Isolierscheibe. Die Isolierscheibe erhöht den Wärmewiderstand zwischen Transistorgehäuse und Kühlkörper (</w:t>
       </w:r>
-      <w:proofErr w:type="spellStart"/>
-      <w:r>
-        <w:rPr>
-          <w:rFonts w:asciiTheme="minorHAnsi" w:hAnsiTheme="minorHAnsi"/>
-          <w:sz w:val="24"/>
-        </w:rPr>
-        <w:t>Rth,CS</w:t>
-      </w:r>
-      <w:proofErr w:type="spellEnd"/>
+      <m:oMath>
+        <m:sSub>
+          <m:sSubPr>
+            <m:ctrlPr>
+              <w:rPr>
+                <w:rFonts w:ascii="Cambria Math" w:hAnsi="Cambria Math"/>
+                <w:i/>
+                <w:sz w:val="24"/>
+              </w:rPr>
+            </m:ctrlPr>
+          </m:sSubPr>
+          <m:e>
+            <m:r>
+              <w:rPr>
+                <w:rFonts w:ascii="Cambria Math" w:hAnsi="Cambria Math"/>
+                <w:sz w:val="24"/>
+              </w:rPr>
+              <m:t>R</m:t>
+            </m:r>
+          </m:e>
+          <m:sub>
+            <m:r>
+              <w:rPr>
+                <w:rFonts w:ascii="Cambria Math" w:hAnsi="Cambria Math"/>
+                <w:sz w:val="24"/>
+              </w:rPr>
+              <m:t>th,CS</m:t>
+            </m:r>
+          </m:sub>
+        </m:sSub>
+      </m:oMath>
       <w:r>
         <w:rPr>
           <w:rFonts w:asciiTheme="minorHAnsi" w:hAnsiTheme="minorHAnsi"/>
@@ -30293,22 +30239,6 @@
           <w:rFonts w:asciiTheme="minorHAnsi" w:hAnsiTheme="minorHAnsi"/>
           <w:sz w:val="24"/>
         </w:rPr>
-        <w:t>Die mit den Thermistoren gemessenen Kühlkörpertemperaturen liegen deutlich unter der Gehäusetemperatur des Transistors. Dies entspricht den Erwartungen, da zwischen Sperrschicht, Gehäuse, Kühlkörper und Umgebung jeweils Wärmewiderstände vorhanden sind. Entsprechend fällt entlang des Wärmepfades eine Temperaturdifferenz ab. Der Kühlkörper erreicht daher eine niedrigere Temperatur als das Transistorgehäuse.</w:t>
-      </w:r>
-    </w:p>
-    <w:p>
-      <w:pPr>
-        <w:pStyle w:val="thFlusstext"/>
-        <w:rPr>
-          <w:rFonts w:asciiTheme="minorHAnsi" w:hAnsiTheme="minorHAnsi"/>
-          <w:sz w:val="24"/>
-        </w:rPr>
-      </w:pPr>
-      <w:r>
-        <w:rPr>
-          <w:rFonts w:asciiTheme="minorHAnsi" w:hAnsiTheme="minorHAnsi"/>
-          <w:sz w:val="24"/>
-        </w:rPr>
         <w:t>Die aus Kollektorstrom und Kollektor-Emitter-Spannung berechnete Verlustleistung lag während des stationären Betriebs bei etwa 2,7 W bis 3 W. Die Verlustleistung nahm während des Aufheizens leicht ab, da die Kollektor-Emitter-Spannung mit steigender Temperatur zurückging. Dieses Verhalten entspricht den Eigenschaften eines Bipolartransistors und wurde sowohl durch die händischen Messungen als auch durch die Daten des Mikrocontrollers bestätigt.</w:t>
       </w:r>
     </w:p>
@@ -30325,58 +30255,80 @@
           <w:rFonts w:asciiTheme="minorHAnsi" w:hAnsiTheme="minorHAnsi"/>
           <w:sz w:val="24"/>
         </w:rPr>
-        <w:t>Zwischen den theoretischen Vorhersagen und den Messergebnissen bestehen gewisse Abweichungen. Diese lassen sich durch verschiedene Einflüsse erklären. Zum einen wurden die theoretischen Berechnungen mit vereinfachten Ersatzschaltbildern durchgeführt, bei denen beispielsweise</w:t>
+        <w:t>An den Messerergebnissen ist zu bemerken, dass bei der Auswertung des Transistors ohne Isolierscheibe sowohl bei der Auswertung durch die ParamId</w:t>
       </w:r>
       <w:r>
         <w:rPr>
           <w:rFonts w:asciiTheme="minorHAnsi" w:hAnsiTheme="minorHAnsi"/>
           <w:sz w:val="24"/>
         </w:rPr>
-        <w:t xml:space="preserve"> nicht die Wärmekapazität Schraube und Mutter der Befestigung </w:t>
-      </w:r>
-      <w:proofErr w:type="spellStart"/>
-      <w:r>
-        <w:rPr>
-          <w:rFonts w:asciiTheme="minorHAnsi" w:hAnsiTheme="minorHAnsi"/>
-          <w:sz w:val="24"/>
-        </w:rPr>
-        <w:t>breücksichtigt</w:t>
-      </w:r>
-      <w:proofErr w:type="spellEnd"/>
-      <w:r>
-        <w:rPr>
-          <w:rFonts w:asciiTheme="minorHAnsi" w:hAnsiTheme="minorHAnsi"/>
-          <w:sz w:val="24"/>
-        </w:rPr>
-        <w:t>.</w:t>
+        <w:t>-</w:t>
       </w:r>
       <w:r>
         <w:rPr>
           <w:rFonts w:asciiTheme="minorHAnsi" w:hAnsiTheme="minorHAnsi"/>
           <w:sz w:val="24"/>
         </w:rPr>
-        <w:t xml:space="preserve"> Auch wird von einer idealen Wärmeübertragung zwischen den Komponenten ausgegangen</w:t>
+        <w:t>Software als auch bei der händischen Berechnung eine negative Temperaturdifferenz zwischen Sperrschicht und Gehäuse berechnet wurde. Die</w:t>
       </w:r>
       <w:r>
         <w:rPr>
           <w:rFonts w:asciiTheme="minorHAnsi" w:hAnsiTheme="minorHAnsi"/>
           <w:sz w:val="24"/>
         </w:rPr>
-        <w:t>. Zum anderen können Messunsicherheiten der Temperaturfühler</w:t>
+        <w:t>s</w:t>
       </w:r>
       <w:r>
         <w:rPr>
           <w:rFonts w:asciiTheme="minorHAnsi" w:hAnsiTheme="minorHAnsi"/>
           <w:sz w:val="24"/>
         </w:rPr>
-        <w:t xml:space="preserve"> und</w:t>
+        <w:t xml:space="preserve"> führt zu einem negativen Wert für </w:t>
+      </w:r>
+      <m:oMath>
+        <m:sSub>
+          <m:sSubPr>
+            <m:ctrlPr>
+              <w:rPr>
+                <w:rFonts w:ascii="Cambria Math" w:hAnsi="Cambria Math"/>
+                <w:i/>
+                <w:sz w:val="24"/>
+              </w:rPr>
+            </m:ctrlPr>
+          </m:sSubPr>
+          <m:e>
+            <m:r>
+              <w:rPr>
+                <w:rFonts w:ascii="Cambria Math" w:hAnsi="Cambria Math"/>
+                <w:sz w:val="24"/>
+              </w:rPr>
+              <m:t>R</m:t>
+            </m:r>
+          </m:e>
+          <m:sub>
+            <m:r>
+              <w:rPr>
+                <w:rFonts w:ascii="Cambria Math" w:hAnsi="Cambria Math"/>
+                <w:sz w:val="24"/>
+              </w:rPr>
+              <m:t>th,JC</m:t>
+            </m:r>
+          </m:sub>
+        </m:sSub>
+      </m:oMath>
+      <w:r>
+        <w:rPr>
+          <w:rFonts w:asciiTheme="minorHAnsi" w:hAnsiTheme="minorHAnsi"/>
+          <w:sz w:val="24"/>
+        </w:rPr>
+        <w:t>,</w:t>
       </w:r>
       <w:r>
         <w:rPr>
           <w:rFonts w:asciiTheme="minorHAnsi" w:hAnsiTheme="minorHAnsi"/>
           <w:sz w:val="24"/>
         </w:rPr>
-        <w:t xml:space="preserve"> Fertigungstoleranzen der Bauteile zu Abweichungen führen.</w:t>
+        <w:t xml:space="preserve"> welcher physikalisch nicht möglich ist.</w:t>
       </w:r>
     </w:p>
     <w:p>
@@ -30392,8 +30344,73 @@
           <w:rFonts w:asciiTheme="minorHAnsi" w:hAnsiTheme="minorHAnsi"/>
           <w:sz w:val="24"/>
         </w:rPr>
+        <w:t>Die weiteren Abweichungen zwischen berechneten und gemessenen Werten lassen sich auf Idealisierungen bei der Berechnung zurückführen. So wurden ideale thermische Übertragungen zwischen Komponenten angenommen und die Verbindungselemente (Schraube, Mutter) vernachlässigt. Dies führt zu einer geringeren thermischen Kapazität der Vorrichtung in der Berechnung und einer länger gemessenen Zeitkonstanten-</w:t>
+      </w:r>
+    </w:p>
+    <w:p>
+      <w:pPr>
+        <w:pStyle w:val="thFlusstext"/>
+        <w:rPr>
+          <w:rFonts w:asciiTheme="minorHAnsi" w:hAnsiTheme="minorHAnsi"/>
+          <w:sz w:val="24"/>
+        </w:rPr>
+      </w:pPr>
+      <w:r>
+        <w:rPr>
+          <w:rFonts w:asciiTheme="minorHAnsi" w:hAnsiTheme="minorHAnsi"/>
+          <w:sz w:val="24"/>
+        </w:rPr>
+        <w:t xml:space="preserve">insgesamt </w:t>
+      </w:r>
+      <w:r>
+        <w:rPr>
+          <w:rFonts w:asciiTheme="minorHAnsi" w:hAnsiTheme="minorHAnsi"/>
+          <w:sz w:val="24"/>
+        </w:rPr>
+        <w:t>bestätigen d</w:t>
+      </w:r>
+      <w:r>
+        <w:rPr>
+          <w:rFonts w:asciiTheme="minorHAnsi" w:hAnsiTheme="minorHAnsi"/>
+          <w:sz w:val="24"/>
+        </w:rPr>
+        <w:t xml:space="preserve">ie Messungen die theoretischen Zusammenhänge zwischen Verlustleistung, Wärmewiderstand, Wärmekapazität und Temperaturverlauf. </w:t>
+      </w:r>
+      <w:r>
+        <w:rPr>
+          <w:rFonts w:asciiTheme="minorHAnsi" w:hAnsiTheme="minorHAnsi"/>
+          <w:sz w:val="24"/>
+        </w:rPr>
+        <w:t>D</w:t>
+      </w:r>
+      <w:r>
+        <w:rPr>
+          <w:rFonts w:asciiTheme="minorHAnsi" w:hAnsiTheme="minorHAnsi"/>
+          <w:sz w:val="24"/>
+        </w:rPr>
+        <w:t xml:space="preserve">eutlich konnte </w:t>
+      </w:r>
+      <w:r>
+        <w:rPr>
+          <w:rFonts w:asciiTheme="minorHAnsi" w:hAnsiTheme="minorHAnsi"/>
+          <w:sz w:val="24"/>
+        </w:rPr>
+        <w:t xml:space="preserve">auch </w:t>
+      </w:r>
+      <w:r>
+        <w:rPr>
+          <w:rFonts w:asciiTheme="minorHAnsi" w:hAnsiTheme="minorHAnsi"/>
+          <w:sz w:val="24"/>
+        </w:rPr>
+        <w:t xml:space="preserve">der Einfluss eines zusätzlichen Wärmewiderstandes durch die </w:t>
+      </w:r>
+      <w:r>
+        <w:rPr>
+          <w:rFonts w:asciiTheme="minorHAnsi" w:hAnsiTheme="minorHAnsi"/>
+          <w:sz w:val="24"/>
+        </w:rPr>
         <w:lastRenderedPageBreak/>
-        <w:t>Die Messungen bestätigen insgesamt die theoretischen Zusammenhänge zwischen Verlustleistung, Wärmewiderstand, Wärmekapazität und Temperaturverlauf. Besonders deutlich konnte der Einfluss eines zusätzlichen Wärmewiderstandes durch die keramische Isolierscheibe nachgewiesen werden. Darüber hinaus wurde gezeigt, dass sich thermische Systeme mit den aus der Elektrotechnik bekannten Methoden der RC-Modellierung sehr gut beschreiben lassen. Die Versuchsergebnisse stimmen qualitativ und weitgehend auch quantitativ mit den theoretischen Erwartungen überein.</w:t>
+        <w:t>keramische Isolierscheibe nachgewiesen werden. Darüber hinaus wurde gezeigt, dass sich thermische Systeme mit den aus der Elektrotechnik bekannten Methoden der RC-Modellierung sehr gut beschreiben lassen. Die Versuchsergebnisse stimmen qualitativ und weitgehend auch quantitativ mit den theoretischen Erwartungen überein.</w:t>
       </w:r>
     </w:p>
     <w:p>

</xml_diff>